<commit_message>
Add public GitHub URL for reproducible workflows.
</commit_message>
<xml_diff>
--- a/docs/NOLHC_ML_Engine_Due_Diligence_Report.docx
+++ b/docs/NOLHC_ML_Engine_Due_Diligence_Report.docx
@@ -3422,11 +3422,11 @@
             <w:b/>
             <w:bCs/>
           </w:rPr>
-          <w:t xml:space="preserve">https://github.com/[YourUsername]/[YourRepoName]</w:t>
+          <w:t xml:space="preserve">https://github.com/nilashree28-wq/NOLHC-ML-Engine</w:t>
         </w:r>
       </w:hyperlink>
       <w:r>
-        <w:t xml:space="preserve">. Replace this link with the final public repository URL once the push is complete. Following the steps in this section on a fresh clone should be enough to reinstall dependencies and regenerate the results summarised in this report.</w:t>
+        <w:t xml:space="preserve">. Following the steps in this section on a fresh clone should be enough to reinstall dependencies and regenerate the results summarised in this report.</w:t>
       </w:r>
     </w:p>
     <w:p>

</xml_diff>

<commit_message>
Add white-background NOLHC pipeline figure to due diligence report.
</commit_message>
<xml_diff>
--- a/docs/NOLHC_ML_Engine_Due_Diligence_Report.docx
+++ b/docs/NOLHC_ML_Engine_Due_Diligence_Report.docx
@@ -2,7 +2,7 @@
 <file path=word/document.xml><?xml version="1.0" encoding="utf-8"?>
 <w:document xmlns:w="http://schemas.openxmlformats.org/wordprocessingml/2006/main" xmlns:m="http://schemas.openxmlformats.org/officeDocument/2006/math" xmlns:r="http://schemas.openxmlformats.org/officeDocument/2006/relationships" xmlns:o="urn:schemas-microsoft-com:office:office" xmlns:v="urn:schemas-microsoft-com:vml" xmlns:w10="urn:schemas-microsoft-com:office:word" xmlns:a="http://schemas.openxmlformats.org/drawingml/2006/main" xmlns:pic="http://schemas.openxmlformats.org/drawingml/2006/picture" xmlns:wp="http://schemas.openxmlformats.org/drawingml/2006/wordprocessingDrawing">
   <w:body>
-    <w:bookmarkStart w:id="47" w:name="due-diligence-report"/>
+    <w:bookmarkStart w:id="50" w:name="due-diligence-report"/>
     <w:p>
       <w:pPr>
         <w:pStyle w:val="Heading1"/>
@@ -826,7 +826,7 @@
       </w:r>
     </w:p>
     <w:bookmarkEnd w:id="15"/>
-    <w:bookmarkStart w:id="20" w:name="technical-architecture"/>
+    <w:bookmarkStart w:id="23" w:name="technical-architecture"/>
     <w:p>
       <w:pPr>
         <w:pStyle w:val="Heading2"/>
@@ -835,7 +835,7 @@
         <w:t xml:space="preserve">5. Technical Architecture</w:t>
       </w:r>
     </w:p>
-    <w:bookmarkStart w:id="16" w:name="logical-architecture"/>
+    <w:bookmarkStart w:id="19" w:name="logical-architecture"/>
     <w:p>
       <w:pPr>
         <w:pStyle w:val="Heading3"/>
@@ -972,51 +972,124 @@
         <w:t xml:space="preserve">              Browser UI (Leaflet map + KPI panels)</w:t>
       </w:r>
     </w:p>
-    <w:bookmarkEnd w:id="16"/>
-    <w:bookmarkStart w:id="17" w:name="modelling-approach"/>
-    <w:p>
-      <w:pPr>
-        <w:pStyle w:val="Heading3"/>
-      </w:pPr>
-      <w:r>
-        <w:t xml:space="preserve">5.2 Modelling approach</w:t>
-      </w:r>
-    </w:p>
     <w:p>
       <w:pPr>
         <w:pStyle w:val="FirstParagraph"/>
       </w:pPr>
-      <w:r>
-        <w:t xml:space="preserve">For each of the 20 KPIs the pipeline benchmarks a broad candidate set (Gaussian Process variants, tree ensembles including Random Forest / Extra Trees / Gradient Boosting / XGBoost / LightGBM / CatBoost, SVR, polynomial pipelines, linear/penalised models, KNN, MLP, AdaBoost). Selection uses cross-validation on the training pool. In</w:t>
-      </w:r>
-      <w:r>
-        <w:t xml:space="preserve"> </w:t>
-      </w:r>
-      <w:r>
-        <w:rPr>
-          <w:rStyle w:val="VerbatimChar"/>
-        </w:rPr>
-        <w:t xml:space="preserve">nolhc_ml</w:t>
-      </w:r>
-      <w:r>
-        <w:t xml:space="preserve">, a stacking ensemble is compared with the best single model and the stronger of the two is registered.</w:t>
-      </w:r>
-    </w:p>
-    <w:p>
-      <w:pPr>
-        <w:pStyle w:val="BodyText"/>
-      </w:pPr>
-      <w:r>
-        <w:t xml:space="preserve">Hold-out design used for reported evaluation:</w:t>
-      </w:r>
-      <w:r>
-        <w:t xml:space="preserve"> </w:t>
-      </w:r>
       <w:r>
         <w:rPr>
           <w:b/>
           <w:bCs/>
         </w:rPr>
+        <w:t xml:space="preserve">Figure 1.</w:t>
+      </w:r>
+      <w:r>
+        <w:t xml:space="preserve"> </w:t>
+      </w:r>
+      <w:r>
+        <w:t xml:space="preserve">End-to-end AnyLogic NOLHC surrogate pipeline (data ingestion → training / evaluation &amp; SHAP → inference API and browser UI, with scenario mapping as a runtime override).</w:t>
+      </w:r>
+    </w:p>
+    <w:p>
+      <w:pPr>
+        <w:pStyle w:val="CaptionedFigure"/>
+      </w:pPr>
+      <w:r>
+        <w:drawing>
+          <wp:inline>
+            <wp:extent cx="5334000" cy="8001000"/>
+            <wp:effectExtent b="0" l="0" r="0" t="0"/>
+            <wp:docPr descr="Figure 1. AnyLogic NOLHC Surrogate Pipeline" title="" id="17" name="Picture"/>
+            <a:graphic>
+              <a:graphicData uri="http://schemas.openxmlformats.org/drawingml/2006/picture">
+                <pic:pic>
+                  <pic:nvPicPr>
+                    <pic:cNvPr descr="figures/nolhc_surrogate_pipeline_white.png" id="18" name="Picture"/>
+                    <pic:cNvPicPr>
+                      <a:picLocks noChangeArrowheads="1" noChangeAspect="1"/>
+                    </pic:cNvPicPr>
+                  </pic:nvPicPr>
+                  <pic:blipFill>
+                    <a:blip r:embed="rId16"/>
+                    <a:stretch>
+                      <a:fillRect/>
+                    </a:stretch>
+                  </pic:blipFill>
+                  <pic:spPr bwMode="auto">
+                    <a:xfrm>
+                      <a:off x="0" y="0"/>
+                      <a:ext cx="5334000" cy="8001000"/>
+                    </a:xfrm>
+                    <a:prstGeom prst="rect">
+                      <a:avLst/>
+                    </a:prstGeom>
+                    <a:noFill/>
+                    <a:ln w="9525">
+                      <a:noFill/>
+                      <a:headEnd/>
+                      <a:tailEnd/>
+                    </a:ln>
+                  </pic:spPr>
+                </pic:pic>
+              </a:graphicData>
+            </a:graphic>
+          </wp:inline>
+        </w:drawing>
+      </w:r>
+    </w:p>
+    <w:p>
+      <w:pPr>
+        <w:pStyle w:val="ImageCaption"/>
+      </w:pPr>
+      <w:r>
+        <w:t xml:space="preserve">Figure 1. AnyLogic NOLHC Surrogate Pipeline</w:t>
+      </w:r>
+    </w:p>
+    <w:bookmarkEnd w:id="19"/>
+    <w:bookmarkStart w:id="20" w:name="modelling-approach"/>
+    <w:p>
+      <w:pPr>
+        <w:pStyle w:val="Heading3"/>
+      </w:pPr>
+      <w:r>
+        <w:t xml:space="preserve">5.2 Modelling approach</w:t>
+      </w:r>
+    </w:p>
+    <w:p>
+      <w:pPr>
+        <w:pStyle w:val="FirstParagraph"/>
+      </w:pPr>
+      <w:r>
+        <w:t xml:space="preserve">For each of the 20 KPIs the pipeline benchmarks a broad candidate set (Gaussian Process variants, tree ensembles including Random Forest / Extra Trees / Gradient Boosting / XGBoost / LightGBM / CatBoost, SVR, polynomial pipelines, linear/penalised models, KNN, MLP, AdaBoost). Selection uses cross-validation on the training pool. In</w:t>
+      </w:r>
+      <w:r>
+        <w:t xml:space="preserve"> </w:t>
+      </w:r>
+      <w:r>
+        <w:rPr>
+          <w:rStyle w:val="VerbatimChar"/>
+        </w:rPr>
+        <w:t xml:space="preserve">nolhc_ml</w:t>
+      </w:r>
+      <w:r>
+        <w:t xml:space="preserve">, a stacking ensemble is compared with the best single model and the stronger of the two is registered.</w:t>
+      </w:r>
+    </w:p>
+    <w:p>
+      <w:pPr>
+        <w:pStyle w:val="BodyText"/>
+      </w:pPr>
+      <w:r>
+        <w:t xml:space="preserve">Hold-out design used for reported evaluation:</w:t>
+      </w:r>
+      <w:r>
+        <w:t xml:space="preserve"> </w:t>
+      </w:r>
+      <w:r>
+        <w:rPr>
+          <w:b/>
+          <w:bCs/>
+        </w:rPr>
         <w:t xml:space="preserve">103 train / 26 test</w:t>
       </w:r>
       <w:r>
@@ -1035,8 +1108,8 @@
         <w:t xml:space="preserve">) is fit on training rows only for models that need it; tree models use unscaled inputs.</w:t>
       </w:r>
     </w:p>
-    <w:bookmarkEnd w:id="17"/>
-    <w:bookmarkStart w:id="18" w:name="inference-and-ui"/>
+    <w:bookmarkEnd w:id="20"/>
+    <w:bookmarkStart w:id="21" w:name="inference-and-ui"/>
     <w:p>
       <w:pPr>
         <w:pStyle w:val="Heading3"/>
@@ -1147,8 +1220,8 @@
         <w:t xml:space="preserve">) serving the mentor scenario UI, with fields for scenario family, level, slider overrides, and focus target for SHAP.</w:t>
       </w:r>
     </w:p>
-    <w:bookmarkEnd w:id="18"/>
-    <w:bookmarkStart w:id="19" w:name="explainability-layer"/>
+    <w:bookmarkEnd w:id="21"/>
+    <w:bookmarkStart w:id="22" w:name="explainability-layer"/>
     <w:p>
       <w:pPr>
         <w:pStyle w:val="Heading3"/>
@@ -1193,9 +1266,9 @@
         </w:pict>
       </w:r>
     </w:p>
-    <w:bookmarkEnd w:id="19"/>
-    <w:bookmarkEnd w:id="20"/>
-    <w:bookmarkStart w:id="25" w:name="dataset"/>
+    <w:bookmarkEnd w:id="22"/>
+    <w:bookmarkEnd w:id="23"/>
+    <w:bookmarkStart w:id="28" w:name="dataset"/>
     <w:p>
       <w:pPr>
         <w:pStyle w:val="Heading2"/>
@@ -1204,7 +1277,7 @@
         <w:t xml:space="preserve">6. Dataset</w:t>
       </w:r>
     </w:p>
-    <w:bookmarkStart w:id="21" w:name="source-and-design"/>
+    <w:bookmarkStart w:id="24" w:name="source-and-design"/>
     <w:p>
       <w:pPr>
         <w:pStyle w:val="Heading3"/>
@@ -1465,8 +1538,8 @@
         </w:tc>
       </w:tr>
     </w:tbl>
-    <w:bookmarkEnd w:id="21"/>
-    <w:bookmarkStart w:id="22" w:name="input-groups-35-parameters"/>
+    <w:bookmarkEnd w:id="24"/>
+    <w:bookmarkStart w:id="25" w:name="input-groups-35-parameters"/>
     <w:p>
       <w:pPr>
         <w:pStyle w:val="Heading3"/>
@@ -1616,8 +1689,8 @@
         <w:t xml:space="preserve">— green/red/pre-board routing fractions for inbound and outbound flows.</w:t>
       </w:r>
     </w:p>
-    <w:bookmarkEnd w:id="22"/>
-    <w:bookmarkStart w:id="23" w:name="output-kpis-20"/>
+    <w:bookmarkEnd w:id="25"/>
+    <w:bookmarkStart w:id="26" w:name="output-kpis-20"/>
     <w:p>
       <w:pPr>
         <w:pStyle w:val="Heading3"/>
@@ -1746,8 +1819,8 @@
         <w:t xml:space="preserve">rather than forcing a single global regressor.</w:t>
       </w:r>
     </w:p>
-    <w:bookmarkEnd w:id="23"/>
-    <w:bookmarkStart w:id="24" w:name="data-handling-notes-for-diligence"/>
+    <w:bookmarkEnd w:id="26"/>
+    <w:bookmarkStart w:id="27" w:name="data-handling-notes-for-diligence"/>
     <w:p>
       <w:pPr>
         <w:pStyle w:val="Heading3"/>
@@ -1799,9 +1872,9 @@
         </w:pict>
       </w:r>
     </w:p>
-    <w:bookmarkEnd w:id="24"/>
-    <w:bookmarkEnd w:id="25"/>
-    <w:bookmarkStart w:id="28" w:name="scenario-model-and-kpi-framework"/>
+    <w:bookmarkEnd w:id="27"/>
+    <w:bookmarkEnd w:id="28"/>
+    <w:bookmarkStart w:id="31" w:name="scenario-model-and-kpi-framework"/>
     <w:p>
       <w:pPr>
         <w:pStyle w:val="Heading2"/>
@@ -1810,7 +1883,7 @@
         <w:t xml:space="preserve">7. Scenario Model and KPI Framework</w:t>
       </w:r>
     </w:p>
-    <w:bookmarkStart w:id="26" w:name="kpi-framework"/>
+    <w:bookmarkStart w:id="29" w:name="kpi-framework"/>
     <w:p>
       <w:pPr>
         <w:pStyle w:val="Heading3"/>
@@ -1827,8 +1900,8 @@
         <w:t xml:space="preserve">The KPI set is the SimResults vector from the NOLHC design. For diligence and UI presentation it is useful to keep the four buckets above (Agri, Non-Agri, Routes, Utilisation). Prediction quality is judged with RMSE, MAE, and R² on CV and hold-out, plus interval width where conformal / residual-based 90% intervals are reported.</w:t>
       </w:r>
     </w:p>
-    <w:bookmarkEnd w:id="26"/>
-    <w:bookmarkStart w:id="27" w:name="X950af982978b8a66fe80dc1670f341c7a97815f"/>
+    <w:bookmarkEnd w:id="29"/>
+    <w:bookmarkStart w:id="30" w:name="X950af982978b8a66fe80dc1670f341c7a97815f"/>
     <w:p>
       <w:pPr>
         <w:pStyle w:val="Heading3"/>
@@ -2045,9 +2118,9 @@
         </w:pict>
       </w:r>
     </w:p>
-    <w:bookmarkEnd w:id="27"/>
-    <w:bookmarkEnd w:id="28"/>
-    <w:bookmarkStart w:id="30" w:name="progress-to-date"/>
+    <w:bookmarkEnd w:id="30"/>
+    <w:bookmarkEnd w:id="31"/>
+    <w:bookmarkStart w:id="33" w:name="progress-to-date"/>
     <w:p>
       <w:pPr>
         <w:pStyle w:val="Heading2"/>
@@ -2306,7 +2379,7 @@
         <w:t xml:space="preserve">.</w:t>
       </w:r>
     </w:p>
-    <w:bookmarkStart w:id="29" w:name="X7b54c628f6f658600471a74bc4e578c7927f00b"/>
+    <w:bookmarkStart w:id="32" w:name="X7b54c628f6f658600471a74bc4e578c7927f00b"/>
     <w:p>
       <w:pPr>
         <w:pStyle w:val="Heading3"/>
@@ -2475,9 +2548,9 @@
         </w:pict>
       </w:r>
     </w:p>
-    <w:bookmarkEnd w:id="29"/>
-    <w:bookmarkEnd w:id="30"/>
-    <w:bookmarkStart w:id="37" w:name="current-status-and-scope"/>
+    <w:bookmarkEnd w:id="32"/>
+    <w:bookmarkEnd w:id="33"/>
+    <w:bookmarkStart w:id="40" w:name="current-status-and-scope"/>
     <w:p>
       <w:pPr>
         <w:pStyle w:val="Heading2"/>
@@ -2486,7 +2559,7 @@
         <w:t xml:space="preserve">9. Current Status and Scope</w:t>
       </w:r>
     </w:p>
-    <w:bookmarkStart w:id="31" w:name="current-status"/>
+    <w:bookmarkStart w:id="34" w:name="current-status"/>
     <w:p>
       <w:pPr>
         <w:pStyle w:val="Heading3"/>
@@ -2750,8 +2823,8 @@
         </w:tc>
       </w:tr>
     </w:tbl>
-    <w:bookmarkEnd w:id="31"/>
-    <w:bookmarkStart w:id="32" w:name="in-scope"/>
+    <w:bookmarkEnd w:id="34"/>
+    <w:bookmarkStart w:id="35" w:name="in-scope"/>
     <w:p>
       <w:pPr>
         <w:pStyle w:val="Heading3"/>
@@ -2820,8 +2893,8 @@
         <w:t xml:space="preserve">Preparation notes for journalisation (Appendix A).</w:t>
       </w:r>
     </w:p>
-    <w:bookmarkEnd w:id="32"/>
-    <w:bookmarkStart w:id="33" w:name="out-of-scope-current-boundary"/>
+    <w:bookmarkEnd w:id="35"/>
+    <w:bookmarkStart w:id="36" w:name="out-of-scope-current-boundary"/>
     <w:p>
       <w:pPr>
         <w:pStyle w:val="Heading3"/>
@@ -2890,8 +2963,8 @@
         <w:t xml:space="preserve">Commercial SLA, multi-user auth, or production MLOps beyond local registry files.</w:t>
       </w:r>
     </w:p>
-    <w:bookmarkEnd w:id="33"/>
-    <w:bookmarkStart w:id="36" w:name="ethics-code-followed"/>
+    <w:bookmarkEnd w:id="36"/>
+    <w:bookmarkStart w:id="39" w:name="ethics-code-followed"/>
     <w:p>
       <w:pPr>
         <w:pStyle w:val="Heading3"/>
@@ -2925,7 +2998,7 @@
       <w:r>
         <w:br/>
       </w:r>
-      <w:hyperlink r:id="rId34">
+      <w:hyperlink r:id="rId37">
         <w:r>
           <w:rPr>
             <w:rStyle w:val="Hyperlink"/>
@@ -2957,7 +3030,7 @@
       <w:r>
         <w:br/>
       </w:r>
-      <w:hyperlink r:id="rId35">
+      <w:hyperlink r:id="rId38">
         <w:r>
           <w:rPr>
             <w:rStyle w:val="Hyperlink"/>
@@ -3051,9 +3124,9 @@
         </w:pict>
       </w:r>
     </w:p>
-    <w:bookmarkEnd w:id="36"/>
-    <w:bookmarkEnd w:id="37"/>
-    <w:bookmarkStart w:id="38" w:name="technology-stack"/>
+    <w:bookmarkEnd w:id="39"/>
+    <w:bookmarkEnd w:id="40"/>
+    <w:bookmarkStart w:id="41" w:name="technology-stack"/>
     <w:p>
       <w:pPr>
         <w:pStyle w:val="Heading2"/>
@@ -3320,8 +3393,8 @@
         </w:pict>
       </w:r>
     </w:p>
-    <w:bookmarkEnd w:id="38"/>
-    <w:bookmarkStart w:id="43" w:name="repository-and-workflow"/>
+    <w:bookmarkEnd w:id="41"/>
+    <w:bookmarkStart w:id="46" w:name="repository-and-workflow"/>
     <w:p>
       <w:pPr>
         <w:pStyle w:val="Heading2"/>
@@ -3330,7 +3403,7 @@
         <w:t xml:space="preserve">11. Repository and Workflow</w:t>
       </w:r>
     </w:p>
-    <w:bookmarkStart w:id="39" w:name="repository-map"/>
+    <w:bookmarkStart w:id="42" w:name="repository-map"/>
     <w:p>
       <w:pPr>
         <w:pStyle w:val="Heading3"/>
@@ -3395,8 +3468,8 @@
         <w:t xml:space="preserve">└── submission_package*/      # Handover bundles</w:t>
       </w:r>
     </w:p>
-    <w:bookmarkEnd w:id="39"/>
-    <w:bookmarkStart w:id="41" w:name="typical-workflows"/>
+    <w:bookmarkEnd w:id="42"/>
+    <w:bookmarkStart w:id="44" w:name="typical-workflows"/>
     <w:p>
       <w:pPr>
         <w:pStyle w:val="Heading3"/>
@@ -3415,7 +3488,7 @@
       <w:r>
         <w:t xml:space="preserve"> </w:t>
       </w:r>
-      <w:hyperlink r:id="rId40">
+      <w:hyperlink r:id="rId43">
         <w:r>
           <w:rPr>
             <w:rStyle w:val="Hyperlink"/>
@@ -3746,8 +3819,8 @@
         <w:t xml:space="preserve">, and related runners).</w:t>
       </w:r>
     </w:p>
-    <w:bookmarkEnd w:id="41"/>
-    <w:bookmarkStart w:id="42" w:name="key-artefacts-for-assessors"/>
+    <w:bookmarkEnd w:id="44"/>
+    <w:bookmarkStart w:id="45" w:name="key-artefacts-for-assessors"/>
     <w:p>
       <w:pPr>
         <w:pStyle w:val="Heading3"/>
@@ -3874,9 +3947,9 @@
         </w:pict>
       </w:r>
     </w:p>
-    <w:bookmarkEnd w:id="42"/>
-    <w:bookmarkEnd w:id="43"/>
-    <w:bookmarkStart w:id="44" w:name="open-questions-for-mentor"/>
+    <w:bookmarkEnd w:id="45"/>
+    <w:bookmarkEnd w:id="46"/>
+    <w:bookmarkStart w:id="47" w:name="open-questions-for-mentor"/>
     <w:p>
       <w:pPr>
         <w:pStyle w:val="Heading2"/>
@@ -4136,8 +4209,8 @@
         </w:pict>
       </w:r>
     </w:p>
-    <w:bookmarkEnd w:id="44"/>
-    <w:bookmarkStart w:id="45" w:name="conclusion"/>
+    <w:bookmarkEnd w:id="47"/>
+    <w:bookmarkStart w:id="48" w:name="conclusion"/>
     <w:p>
       <w:pPr>
         <w:pStyle w:val="Heading2"/>
@@ -4182,8 +4255,8 @@
         </w:pict>
       </w:r>
     </w:p>
-    <w:bookmarkEnd w:id="45"/>
-    <w:bookmarkStart w:id="46" w:name="references"/>
+    <w:bookmarkEnd w:id="48"/>
+    <w:bookmarkStart w:id="49" w:name="references"/>
     <w:p>
       <w:pPr>
         <w:pStyle w:val="Heading2"/>
@@ -4503,9 +4576,9 @@
         </w:pict>
       </w:r>
     </w:p>
-    <w:bookmarkEnd w:id="46"/>
-    <w:bookmarkEnd w:id="47"/>
-    <w:bookmarkStart w:id="54" w:name="Xbb426de7a881abba89bea9c2238b258f4c55a66"/>
+    <w:bookmarkEnd w:id="49"/>
+    <w:bookmarkEnd w:id="50"/>
+    <w:bookmarkStart w:id="57" w:name="Xbb426de7a881abba89bea9c2238b258f4c55a66"/>
     <w:p>
       <w:pPr>
         <w:pStyle w:val="Heading1"/>
@@ -4522,7 +4595,7 @@
         <w:t xml:space="preserve">This appendix is not the BCP marking spine. It is a working note so the consulting delivery can be turned into a journal manuscript without losing the project’s real contribution.</w:t>
       </w:r>
     </w:p>
-    <w:bookmarkStart w:id="48" w:name="Xc99f8ea1c311b085d696cdb02cdd8701545cf6f"/>
+    <w:bookmarkStart w:id="51" w:name="Xc99f8ea1c311b085d696cdb02cdd8701545cf6f"/>
     <w:p>
       <w:pPr>
         <w:pStyle w:val="Heading2"/>
@@ -4658,8 +4731,8 @@
         <w:t xml:space="preserve">that turns the surrogate into a consulting artefact.</w:t>
       </w:r>
     </w:p>
-    <w:bookmarkEnd w:id="48"/>
-    <w:bookmarkStart w:id="49" w:name="X93fe3a08b441f4f8571cd4ee724a4f96b04435c"/>
+    <w:bookmarkEnd w:id="51"/>
+    <w:bookmarkStart w:id="52" w:name="X93fe3a08b441f4f8571cd4ee724a4f96b04435c"/>
     <w:p>
       <w:pPr>
         <w:pStyle w:val="Heading2"/>
@@ -4758,8 +4831,8 @@
         <w:t xml:space="preserve">A shorter paper comparing tree ensembles, GPR, and regularised linear models on this 129×35×20 surface, with clear guidance on which KPI families favour which model class.</w:t>
       </w:r>
     </w:p>
-    <w:bookmarkEnd w:id="49"/>
-    <w:bookmarkStart w:id="50" w:name="X758fa35c2e69d35c860890451089b731bf77f8b"/>
+    <w:bookmarkEnd w:id="52"/>
+    <w:bookmarkStart w:id="53" w:name="X758fa35c2e69d35c860890451089b731bf77f8b"/>
     <w:p>
       <w:pPr>
         <w:pStyle w:val="Heading2"/>
@@ -4784,8 +4857,8 @@
         <w:t xml:space="preserve">This claim is faithful to the evidence and avoids promising “full simulation replacement.”</w:t>
       </w:r>
     </w:p>
-    <w:bookmarkEnd w:id="50"/>
-    <w:bookmarkStart w:id="51" w:name="a.4-gaps-to-close-before-submission"/>
+    <w:bookmarkEnd w:id="53"/>
+    <w:bookmarkStart w:id="54" w:name="a.4-gaps-to-close-before-submission"/>
     <w:p>
       <w:pPr>
         <w:pStyle w:val="Heading2"/>
@@ -4977,8 +5050,8 @@
         </w:tc>
       </w:tr>
     </w:tbl>
-    <w:bookmarkEnd w:id="51"/>
-    <w:bookmarkStart w:id="52" w:name="Xa7d5bf2725799feded72492772609de23d90a13"/>
+    <w:bookmarkEnd w:id="54"/>
+    <w:bookmarkStart w:id="55" w:name="Xa7d5bf2725799feded72492772609de23d90a13"/>
     <w:p>
       <w:pPr>
         <w:pStyle w:val="Heading2"/>
@@ -5193,8 +5266,8 @@
         </w:tc>
       </w:tr>
     </w:tbl>
-    <w:bookmarkEnd w:id="52"/>
-    <w:bookmarkStart w:id="53" w:name="X3cea9f7657bc0c9331fa24ad8ea2f521def8773"/>
+    <w:bookmarkEnd w:id="55"/>
+    <w:bookmarkStart w:id="56" w:name="X3cea9f7657bc0c9331fa24ad8ea2f521def8773"/>
     <w:p>
       <w:pPr>
         <w:pStyle w:val="Heading2"/>
@@ -5324,8 +5397,8 @@
         <w:t xml:space="preserve">End of due diligence report.</w:t>
       </w:r>
     </w:p>
-    <w:bookmarkEnd w:id="53"/>
-    <w:bookmarkEnd w:id="54"/>
+    <w:bookmarkEnd w:id="56"/>
+    <w:bookmarkEnd w:id="57"/>
     <w:sectPr>
       <w:footnotePr>
         <w:numRestart w:val="eachSect"/>

</xml_diff>